<commit_message>
Agregar segmento de ubicacion geografica de Pompeya al final (narracion + guion visual con mapas)
</commit_message>
<xml_diff>
--- a/guiones/pompeya-ultimas-24-horas-narracion.docx
+++ b/guiones/pompeya-ultimas-24-horas-narracion.docx
@@ -567,6 +567,18 @@
           <w:szCs w:val="28"/>
         </w:rPr>
         <w:t xml:space="preserve">Y el Vesubio, el verdugo, sigue ahí. No está muerto: solo duerme, igual que dormía en el año setenta y nueve. A sus pies, hoy, viven millones de personas en la ciudad de Nápoles y sus alrededores. Es uno de los volcanes más peligrosos del planeta, vigilado las veinticuatro horas. Pompeya no es solo una historia del pasado: es una advertencia que sigue viva, latiendo bajo la tierra.</w:t>
+      </w:r>
+    </w:p>
+    <w:p>
+      <w:pPr>
+        <w:spacing w:after="240" w:line="360" w:lineRule="auto"/>
+      </w:pPr>
+      <w:r>
+        <w:rPr>
+          <w:sz w:val="28"/>
+          <w:szCs w:val="28"/>
+        </w:rPr>
+        <w:t xml:space="preserve">Y quizá te estés preguntando dónde queda exactamente todo esto. Pompeya está en el sur de Italia, en la región de Campania, muy cerca de la ciudad de Nápoles, a orillas del mar Mediterráneo. El Vesubio se alza apenas a diez kilómetros, vigilándola como lo hizo siempre. Hoy puedes caminar por sus calles empedradas, entrar en sus casas y pararte frente a sus moldes: las ruinas están abiertas al público y reciben a millones de visitantes cada año. Y desde casi cualquier punto de la ciudad, al levantar la vista, sigue ahí, inmenso y silencioso, el mismo volcán que cambió su destino.</w:t>
       </w:r>
     </w:p>
     <w:p>

</xml_diff>